<commit_message>
feat: implement matching and quiz game clients with supporting services and page routing
</commit_message>
<xml_diff>
--- a/docs/Revisi UI VAST.docx
+++ b/docs/Revisi UI VAST.docx
@@ -5,13 +5,21 @@
     <w:p>
       <w:pPr>
         <w:rPr>
+          <w:sz w:val="24"/>
+          <w:szCs w:val="24"/>
+        </w:rPr>
+      </w:pPr>
+      <w:proofErr w:type="spellStart"/>
+      <w:r>
+        <w:rPr>
           <w:b/>
           <w:bCs/>
           <w:sz w:val="24"/>
           <w:szCs w:val="24"/>
         </w:rPr>
-      </w:pPr>
-      <w:proofErr w:type="spellStart"/>
+        <w:t>Revisi</w:t>
+      </w:r>
+      <w:proofErr w:type="spellEnd"/>
       <w:r>
         <w:rPr>
           <w:b/>
@@ -19,9 +27,10 @@
           <w:sz w:val="24"/>
           <w:szCs w:val="24"/>
         </w:rPr>
-        <w:t>Revisi</w:t>
-      </w:r>
-      <w:proofErr w:type="spellEnd"/>
+        <w:t xml:space="preserve"> </w:t>
+      </w:r>
+      <w:proofErr w:type="spellStart"/>
+      <w:proofErr w:type="gramStart"/>
       <w:r>
         <w:rPr>
           <w:b/>
@@ -29,9 +38,9 @@
           <w:sz w:val="24"/>
           <w:szCs w:val="24"/>
         </w:rPr>
-        <w:t xml:space="preserve"> </w:t>
-      </w:r>
-      <w:proofErr w:type="gramStart"/>
+        <w:t>Ketiga</w:t>
+      </w:r>
+      <w:proofErr w:type="spellEnd"/>
       <w:r>
         <w:rPr>
           <w:b/>
@@ -39,7 +48,7 @@
           <w:sz w:val="24"/>
           <w:szCs w:val="24"/>
         </w:rPr>
-        <w:t>Kedua :</w:t>
+        <w:t xml:space="preserve"> :</w:t>
       </w:r>
       <w:proofErr w:type="gramEnd"/>
       <w:r>
@@ -59,7 +68,6 @@
           <w:szCs w:val="24"/>
         </w:rPr>
         <w:br/>
-        <w:t xml:space="preserve">Page </w:t>
       </w:r>
       <w:proofErr w:type="gramStart"/>
       <w:r>
@@ -84,17 +92,159 @@
       </w:r>
       <w:r>
         <w:rPr>
+          <w:sz w:val="24"/>
+          <w:szCs w:val="24"/>
+        </w:rPr>
+        <w:t xml:space="preserve">Halaman </w:t>
+      </w:r>
+      <w:proofErr w:type="spellStart"/>
+      <w:r>
+        <w:rPr>
+          <w:sz w:val="24"/>
+          <w:szCs w:val="24"/>
+        </w:rPr>
+        <w:t>soal</w:t>
+      </w:r>
+      <w:proofErr w:type="spellEnd"/>
+      <w:r>
+        <w:rPr>
+          <w:sz w:val="24"/>
+          <w:szCs w:val="24"/>
+        </w:rPr>
+        <w:t xml:space="preserve"> yang </w:t>
+      </w:r>
+      <w:proofErr w:type="spellStart"/>
+      <w:r>
+        <w:rPr>
+          <w:sz w:val="24"/>
+          <w:szCs w:val="24"/>
+        </w:rPr>
+        <w:t>terakhir</w:t>
+      </w:r>
+      <w:proofErr w:type="spellEnd"/>
+      <w:r>
+        <w:rPr>
+          <w:sz w:val="24"/>
+          <w:szCs w:val="24"/>
+        </w:rPr>
+        <w:t xml:space="preserve"> Ketika di submit </w:t>
+      </w:r>
+      <w:proofErr w:type="spellStart"/>
+      <w:r>
+        <w:rPr>
+          <w:sz w:val="24"/>
+          <w:szCs w:val="24"/>
+        </w:rPr>
+        <w:t>masih</w:t>
+      </w:r>
+      <w:proofErr w:type="spellEnd"/>
+      <w:r>
+        <w:rPr>
+          <w:sz w:val="24"/>
+          <w:szCs w:val="24"/>
+        </w:rPr>
+        <w:t xml:space="preserve"> </w:t>
+      </w:r>
+      <w:proofErr w:type="spellStart"/>
+      <w:r>
+        <w:rPr>
+          <w:sz w:val="24"/>
+          <w:szCs w:val="24"/>
+        </w:rPr>
+        <w:t>ngebug</w:t>
+      </w:r>
+      <w:proofErr w:type="spellEnd"/>
+      <w:r>
+        <w:rPr>
+          <w:sz w:val="24"/>
+          <w:szCs w:val="24"/>
+        </w:rPr>
+        <w:t xml:space="preserve">, </w:t>
+      </w:r>
+      <w:proofErr w:type="spellStart"/>
+      <w:r>
+        <w:rPr>
+          <w:sz w:val="24"/>
+          <w:szCs w:val="24"/>
+        </w:rPr>
+        <w:t>masih</w:t>
+      </w:r>
+      <w:proofErr w:type="spellEnd"/>
+      <w:r>
+        <w:rPr>
+          <w:sz w:val="24"/>
+          <w:szCs w:val="24"/>
+        </w:rPr>
+        <w:t xml:space="preserve"> Kembali </w:t>
+      </w:r>
+      <w:proofErr w:type="spellStart"/>
+      <w:r>
+        <w:rPr>
+          <w:sz w:val="24"/>
+          <w:szCs w:val="24"/>
+        </w:rPr>
+        <w:t>ke</w:t>
+      </w:r>
+      <w:proofErr w:type="spellEnd"/>
+      <w:r>
+        <w:rPr>
+          <w:sz w:val="24"/>
+          <w:szCs w:val="24"/>
+        </w:rPr>
+        <w:t xml:space="preserve"> </w:t>
+      </w:r>
+      <w:proofErr w:type="spellStart"/>
+      <w:r>
+        <w:rPr>
+          <w:sz w:val="24"/>
+          <w:szCs w:val="24"/>
+        </w:rPr>
+        <w:t>nomer</w:t>
+      </w:r>
+      <w:proofErr w:type="spellEnd"/>
+      <w:r>
+        <w:rPr>
+          <w:sz w:val="24"/>
+          <w:szCs w:val="24"/>
+        </w:rPr>
+        <w:t xml:space="preserve"> 6</w:t>
+      </w:r>
+    </w:p>
+    <w:p>
+      <w:pPr>
+        <w:rPr>
+          <w:sz w:val="24"/>
+          <w:szCs w:val="24"/>
+        </w:rPr>
+      </w:pPr>
+      <w:r>
+        <w:rPr>
           <w:b/>
           <w:bCs/>
+          <w:sz w:val="24"/>
+          <w:szCs w:val="24"/>
+        </w:rPr>
+        <w:t>2.</w:t>
+      </w:r>
+      <w:r>
+        <w:rPr>
           <w:noProof/>
           <w:sz w:val="24"/>
           <w:szCs w:val="24"/>
         </w:rPr>
+        <w:t xml:space="preserve"> </w:t>
+      </w:r>
+      <w:r>
+        <w:rPr>
+          <w:noProof/>
+          <w:sz w:val="24"/>
+          <w:szCs w:val="24"/>
+        </w:rPr>
         <w:drawing>
-          <wp:inline distT="0" distB="0" distL="0" distR="0" wp14:anchorId="0152A504" wp14:editId="389D0626">
-            <wp:extent cx="2185495" cy="1229311"/>
-            <wp:effectExtent l="0" t="0" r="5715" b="9525"/>
-            <wp:docPr id="543960644" name="Picture 1"/>
+          <wp:inline distT="0" distB="0" distL="0" distR="0" wp14:anchorId="03211C39" wp14:editId="1728F293">
+            <wp:extent cx="2719754" cy="1529824"/>
+            <wp:effectExtent l="0" t="0" r="4445" b="0"/>
+            <wp:docPr id="118483259" name="Picture 1"/>
             <wp:cNvGraphicFramePr>
               <a:graphicFrameLocks xmlns:a="http://schemas.openxmlformats.org/drawingml/2006/main" noChangeAspect="1"/>
             </wp:cNvGraphicFramePr>
@@ -102,11 +252,17 @@
               <a:graphicData uri="http://schemas.openxmlformats.org/drawingml/2006/picture">
                 <pic:pic xmlns:pic="http://schemas.openxmlformats.org/drawingml/2006/picture">
                   <pic:nvPicPr>
-                    <pic:cNvPr id="543960644" name=""/>
+                    <pic:cNvPr id="118483259" name="Picture 118483259"/>
                     <pic:cNvPicPr/>
                   </pic:nvPicPr>
                   <pic:blipFill>
-                    <a:blip r:embed="rId5"/>
+                    <a:blip r:embed="rId5" cstate="print">
+                      <a:extLst>
+                        <a:ext uri="{28A0092B-C50C-407E-A947-70E740481C1C}">
+                          <a14:useLocalDpi xmlns:a14="http://schemas.microsoft.com/office/drawing/2010/main" val="0"/>
+                        </a:ext>
+                      </a:extLst>
+                    </a:blip>
                     <a:stretch>
                       <a:fillRect/>
                     </a:stretch>
@@ -114,7 +270,7 @@
                   <pic:spPr>
                     <a:xfrm>
                       <a:off x="0" y="0"/>
-                      <a:ext cx="2205804" cy="1240734"/>
+                      <a:ext cx="2738901" cy="1540594"/>
                     </a:xfrm>
                     <a:prstGeom prst="rect">
                       <a:avLst/>
@@ -126,240 +282,82 @@
           </wp:inline>
         </w:drawing>
       </w:r>
+      <w:r>
+        <w:rPr>
+          <w:sz w:val="24"/>
+          <w:szCs w:val="24"/>
+        </w:rPr>
+        <w:br/>
+        <w:t xml:space="preserve">di tagline </w:t>
+      </w:r>
+      <w:proofErr w:type="spellStart"/>
+      <w:r>
+        <w:rPr>
+          <w:sz w:val="24"/>
+          <w:szCs w:val="24"/>
+        </w:rPr>
+        <w:t>tertulis</w:t>
+      </w:r>
+      <w:proofErr w:type="spellEnd"/>
+      <w:r>
+        <w:rPr>
+          <w:sz w:val="24"/>
+          <w:szCs w:val="24"/>
+        </w:rPr>
+        <w:t xml:space="preserve"> 10 soal per</w:t>
+      </w:r>
+      <w:proofErr w:type="spellStart"/>
+      <w:r>
+        <w:rPr>
+          <w:sz w:val="24"/>
+          <w:szCs w:val="24"/>
+        </w:rPr>
+        <w:t>onde</w:t>
+      </w:r>
+      <w:proofErr w:type="spellEnd"/>
+      <w:r>
+        <w:rPr>
+          <w:sz w:val="24"/>
+          <w:szCs w:val="24"/>
+        </w:rPr>
+        <w:t xml:space="preserve"> dan </w:t>
+      </w:r>
+      <w:proofErr w:type="spellStart"/>
+      <w:r>
+        <w:rPr>
+          <w:sz w:val="24"/>
+          <w:szCs w:val="24"/>
+        </w:rPr>
+        <w:t>ternyata</w:t>
+      </w:r>
+      <w:proofErr w:type="spellEnd"/>
+      <w:r>
+        <w:rPr>
+          <w:sz w:val="24"/>
+          <w:szCs w:val="24"/>
+        </w:rPr>
+        <w:t xml:space="preserve"> di quiz Cuma </w:t>
+      </w:r>
+      <w:proofErr w:type="spellStart"/>
+      <w:r>
+        <w:rPr>
+          <w:sz w:val="24"/>
+          <w:szCs w:val="24"/>
+        </w:rPr>
+        <w:t>terdapat</w:t>
+      </w:r>
+      <w:proofErr w:type="spellEnd"/>
+      <w:r>
+        <w:rPr>
+          <w:sz w:val="24"/>
+          <w:szCs w:val="24"/>
+        </w:rPr>
+        <w:t xml:space="preserve"> 7</w:t>
+      </w:r>
     </w:p>
     <w:p>
       <w:pPr>
         <w:rPr>
-          <w:sz w:val="24"/>
-          <w:szCs w:val="24"/>
-        </w:rPr>
-      </w:pPr>
-      <w:r>
-        <w:rPr>
-          <w:sz w:val="24"/>
-          <w:szCs w:val="24"/>
-        </w:rPr>
-        <w:t xml:space="preserve">Kasih </w:t>
-      </w:r>
-      <w:proofErr w:type="spellStart"/>
-      <w:r>
-        <w:rPr>
-          <w:sz w:val="24"/>
-          <w:szCs w:val="24"/>
-        </w:rPr>
-        <w:t>gradis</w:t>
-      </w:r>
-      <w:proofErr w:type="spellEnd"/>
-      <w:r>
-        <w:rPr>
-          <w:sz w:val="24"/>
-          <w:szCs w:val="24"/>
-        </w:rPr>
-        <w:t xml:space="preserve"> </w:t>
-      </w:r>
-      <w:proofErr w:type="spellStart"/>
-      <w:r>
-        <w:rPr>
-          <w:sz w:val="24"/>
-          <w:szCs w:val="24"/>
-        </w:rPr>
-        <w:t>warna</w:t>
-      </w:r>
-      <w:proofErr w:type="spellEnd"/>
-      <w:r>
-        <w:rPr>
-          <w:sz w:val="24"/>
-          <w:szCs w:val="24"/>
-        </w:rPr>
-        <w:t xml:space="preserve"> yang </w:t>
-      </w:r>
-      <w:proofErr w:type="spellStart"/>
-      <w:r>
-        <w:rPr>
-          <w:sz w:val="24"/>
-          <w:szCs w:val="24"/>
-        </w:rPr>
-        <w:t>sama</w:t>
-      </w:r>
-      <w:proofErr w:type="spellEnd"/>
-      <w:r>
-        <w:rPr>
-          <w:sz w:val="24"/>
-          <w:szCs w:val="24"/>
-        </w:rPr>
-        <w:t xml:space="preserve">, </w:t>
-      </w:r>
-      <w:proofErr w:type="spellStart"/>
-      <w:r>
-        <w:rPr>
-          <w:sz w:val="24"/>
-          <w:szCs w:val="24"/>
-        </w:rPr>
-        <w:t>trus</w:t>
-      </w:r>
-      <w:proofErr w:type="spellEnd"/>
-      <w:r>
-        <w:rPr>
-          <w:sz w:val="24"/>
-          <w:szCs w:val="24"/>
-        </w:rPr>
-        <w:t xml:space="preserve"> di tagline </w:t>
-      </w:r>
-      <w:proofErr w:type="spellStart"/>
-      <w:r>
-        <w:rPr>
-          <w:sz w:val="24"/>
-          <w:szCs w:val="24"/>
-        </w:rPr>
-        <w:t>bawahnya</w:t>
-      </w:r>
-      <w:proofErr w:type="spellEnd"/>
-      <w:r>
-        <w:rPr>
-          <w:sz w:val="24"/>
-          <w:szCs w:val="24"/>
-        </w:rPr>
-        <w:t xml:space="preserve"> 3 </w:t>
-      </w:r>
-      <w:proofErr w:type="spellStart"/>
-      <w:r>
-        <w:rPr>
-          <w:sz w:val="24"/>
-          <w:szCs w:val="24"/>
-        </w:rPr>
-        <w:t>itu</w:t>
-      </w:r>
-      <w:proofErr w:type="spellEnd"/>
-      <w:r>
-        <w:rPr>
-          <w:sz w:val="24"/>
-          <w:szCs w:val="24"/>
-        </w:rPr>
-        <w:t xml:space="preserve"> </w:t>
-      </w:r>
-      <w:proofErr w:type="spellStart"/>
-      <w:r>
-        <w:rPr>
-          <w:sz w:val="24"/>
-          <w:szCs w:val="24"/>
-        </w:rPr>
-        <w:t>kasih</w:t>
-      </w:r>
-      <w:proofErr w:type="spellEnd"/>
-      <w:r>
-        <w:rPr>
-          <w:sz w:val="24"/>
-          <w:szCs w:val="24"/>
-        </w:rPr>
-        <w:t xml:space="preserve"> </w:t>
-      </w:r>
-      <w:proofErr w:type="spellStart"/>
-      <w:r>
-        <w:rPr>
-          <w:sz w:val="24"/>
-          <w:szCs w:val="24"/>
-        </w:rPr>
-        <w:t>animasi</w:t>
-      </w:r>
-      <w:proofErr w:type="spellEnd"/>
-      <w:r>
-        <w:rPr>
-          <w:sz w:val="24"/>
-          <w:szCs w:val="24"/>
-        </w:rPr>
-        <w:t xml:space="preserve"> </w:t>
-      </w:r>
-      <w:proofErr w:type="spellStart"/>
-      <w:r>
-        <w:rPr>
-          <w:sz w:val="24"/>
-          <w:szCs w:val="24"/>
-        </w:rPr>
-        <w:t>biar</w:t>
-      </w:r>
-      <w:proofErr w:type="spellEnd"/>
-      <w:r>
-        <w:rPr>
-          <w:sz w:val="24"/>
-          <w:szCs w:val="24"/>
-        </w:rPr>
-        <w:t xml:space="preserve"> </w:t>
-      </w:r>
-      <w:proofErr w:type="spellStart"/>
-      <w:r>
-        <w:rPr>
-          <w:sz w:val="24"/>
-          <w:szCs w:val="24"/>
-        </w:rPr>
-        <w:t>ngga</w:t>
-      </w:r>
-      <w:proofErr w:type="spellEnd"/>
-      <w:r>
-        <w:rPr>
-          <w:sz w:val="24"/>
-          <w:szCs w:val="24"/>
-        </w:rPr>
-        <w:t xml:space="preserve"> flat </w:t>
-      </w:r>
-      <w:proofErr w:type="spellStart"/>
-      <w:r>
-        <w:rPr>
-          <w:sz w:val="24"/>
-          <w:szCs w:val="24"/>
-        </w:rPr>
-        <w:t>gitu</w:t>
-      </w:r>
-      <w:proofErr w:type="spellEnd"/>
-      <w:r>
-        <w:rPr>
-          <w:sz w:val="24"/>
-          <w:szCs w:val="24"/>
-        </w:rPr>
-        <w:t xml:space="preserve"> </w:t>
-      </w:r>
-      <w:proofErr w:type="spellStart"/>
-      <w:r>
-        <w:rPr>
-          <w:sz w:val="24"/>
-          <w:szCs w:val="24"/>
-        </w:rPr>
-        <w:t>biar</w:t>
-      </w:r>
-      <w:proofErr w:type="spellEnd"/>
-      <w:r>
-        <w:rPr>
-          <w:sz w:val="24"/>
-          <w:szCs w:val="24"/>
-        </w:rPr>
-        <w:t xml:space="preserve"> </w:t>
-      </w:r>
-      <w:proofErr w:type="spellStart"/>
-      <w:r>
-        <w:rPr>
-          <w:sz w:val="24"/>
-          <w:szCs w:val="24"/>
-        </w:rPr>
-        <w:t>bagus</w:t>
-      </w:r>
-      <w:proofErr w:type="spellEnd"/>
-      <w:r>
-        <w:rPr>
-          <w:sz w:val="24"/>
-          <w:szCs w:val="24"/>
-        </w:rPr>
-        <w:t>.</w:t>
-      </w:r>
-      <w:r>
-        <w:rPr>
-          <w:sz w:val="24"/>
-          <w:szCs w:val="24"/>
-        </w:rPr>
-        <w:br/>
-      </w:r>
-    </w:p>
-    <w:p>
-      <w:pPr>
-        <w:rPr>
           <w:b/>
           <w:bCs/>
           <w:sz w:val="24"/>
@@ -373,27 +371,20 @@
           <w:sz w:val="24"/>
           <w:szCs w:val="24"/>
         </w:rPr>
-        <w:t>2.</w:t>
-      </w:r>
-      <w:r>
-        <w:rPr>
-          <w:noProof/>
-        </w:rPr>
-        <w:t xml:space="preserve"> </w:t>
+        <w:t xml:space="preserve">3. </w:t>
       </w:r>
       <w:r>
         <w:rPr>
           <w:b/>
           <w:bCs/>
-          <w:noProof/>
           <w:sz w:val="24"/>
           <w:szCs w:val="24"/>
         </w:rPr>
         <w:drawing>
-          <wp:inline distT="0" distB="0" distL="0" distR="0" wp14:anchorId="0E683BF6" wp14:editId="7D22313F">
-            <wp:extent cx="2221523" cy="1249576"/>
-            <wp:effectExtent l="0" t="0" r="7620" b="8255"/>
-            <wp:docPr id="1665151969" name="Picture 1"/>
+          <wp:inline distT="0" distB="0" distL="0" distR="0" wp14:anchorId="5C116F5D" wp14:editId="626F100F">
+            <wp:extent cx="1928446" cy="1084724"/>
+            <wp:effectExtent l="0" t="0" r="0" b="1270"/>
+            <wp:docPr id="1029725940" name="Picture 1"/>
             <wp:cNvGraphicFramePr>
               <a:graphicFrameLocks xmlns:a="http://schemas.openxmlformats.org/drawingml/2006/main" noChangeAspect="1"/>
             </wp:cNvGraphicFramePr>
@@ -401,7 +392,7 @@
               <a:graphicData uri="http://schemas.openxmlformats.org/drawingml/2006/picture">
                 <pic:pic xmlns:pic="http://schemas.openxmlformats.org/drawingml/2006/picture">
                   <pic:nvPicPr>
-                    <pic:cNvPr id="1665151969" name=""/>
+                    <pic:cNvPr id="1029725940" name=""/>
                     <pic:cNvPicPr/>
                   </pic:nvPicPr>
                   <pic:blipFill>
@@ -413,7 +404,7 @@
                   <pic:spPr>
                     <a:xfrm>
                       <a:off x="0" y="0"/>
-                      <a:ext cx="2236541" cy="1258024"/>
+                      <a:ext cx="1937952" cy="1090071"/>
                     </a:xfrm>
                     <a:prstGeom prst="rect">
                       <a:avLst/>
@@ -439,7 +430,7 @@
           <w:sz w:val="24"/>
           <w:szCs w:val="24"/>
         </w:rPr>
-        <w:t>Backgroundnya</w:t>
+        <w:t>Datanya</w:t>
       </w:r>
       <w:proofErr w:type="spellEnd"/>
       <w:r>
@@ -455,7 +446,7 @@
           <w:sz w:val="24"/>
           <w:szCs w:val="24"/>
         </w:rPr>
-        <w:t>gradisi</w:t>
+        <w:t>apa</w:t>
       </w:r>
       <w:proofErr w:type="spellEnd"/>
       <w:r>
@@ -471,7 +462,7 @@
           <w:sz w:val="24"/>
           <w:szCs w:val="24"/>
         </w:rPr>
-        <w:t>warnanya</w:t>
+        <w:t>emang</w:t>
       </w:r>
       <w:proofErr w:type="spellEnd"/>
       <w:r>
@@ -487,280 +478,26 @@
           <w:sz w:val="24"/>
           <w:szCs w:val="24"/>
         </w:rPr>
-        <w:t>terlalu</w:t>
-      </w:r>
-      <w:proofErr w:type="spellEnd"/>
-      <w:r>
-        <w:rPr>
-          <w:sz w:val="24"/>
-          <w:szCs w:val="24"/>
-        </w:rPr>
-        <w:t xml:space="preserve"> </w:t>
-      </w:r>
-      <w:proofErr w:type="spellStart"/>
-      <w:r>
-        <w:rPr>
-          <w:sz w:val="24"/>
-          <w:szCs w:val="24"/>
-        </w:rPr>
-        <w:t>gelap</w:t>
-      </w:r>
-      <w:proofErr w:type="spellEnd"/>
-      <w:r>
-        <w:rPr>
-          <w:sz w:val="24"/>
-          <w:szCs w:val="24"/>
-        </w:rPr>
-        <w:t xml:space="preserve"> </w:t>
-      </w:r>
-      <w:proofErr w:type="spellStart"/>
-      <w:r>
-        <w:rPr>
-          <w:sz w:val="24"/>
-          <w:szCs w:val="24"/>
-        </w:rPr>
-        <w:t>pinggirnya</w:t>
-      </w:r>
-      <w:proofErr w:type="spellEnd"/>
-      <w:r>
-        <w:rPr>
-          <w:sz w:val="24"/>
-          <w:szCs w:val="24"/>
-        </w:rPr>
-        <w:t xml:space="preserve"> </w:t>
-      </w:r>
-      <w:proofErr w:type="spellStart"/>
-      <w:r>
-        <w:rPr>
-          <w:sz w:val="24"/>
-          <w:szCs w:val="24"/>
-        </w:rPr>
-        <w:t>jadi</w:t>
-      </w:r>
-      <w:proofErr w:type="spellEnd"/>
-      <w:r>
-        <w:rPr>
-          <w:sz w:val="24"/>
-          <w:szCs w:val="24"/>
-        </w:rPr>
-        <w:t xml:space="preserve"> kaya </w:t>
-      </w:r>
-      <w:proofErr w:type="spellStart"/>
-      <w:r>
-        <w:rPr>
-          <w:sz w:val="24"/>
-          <w:szCs w:val="24"/>
-        </w:rPr>
-        <w:t>ngga</w:t>
-      </w:r>
-      <w:proofErr w:type="spellEnd"/>
-      <w:r>
-        <w:rPr>
-          <w:sz w:val="24"/>
-          <w:szCs w:val="24"/>
-        </w:rPr>
-        <w:t xml:space="preserve"> </w:t>
-      </w:r>
-      <w:proofErr w:type="spellStart"/>
-      <w:r>
-        <w:rPr>
-          <w:sz w:val="24"/>
-          <w:szCs w:val="24"/>
-        </w:rPr>
-        <w:t>keliatan</w:t>
-      </w:r>
-      <w:proofErr w:type="spellEnd"/>
-      <w:r>
-        <w:rPr>
-          <w:sz w:val="24"/>
-          <w:szCs w:val="24"/>
-        </w:rPr>
-        <w:t xml:space="preserve"> </w:t>
-      </w:r>
-      <w:proofErr w:type="spellStart"/>
-      <w:r>
-        <w:rPr>
-          <w:sz w:val="24"/>
-          <w:szCs w:val="24"/>
-        </w:rPr>
-        <w:t>ada</w:t>
-      </w:r>
-      <w:proofErr w:type="spellEnd"/>
-      <w:r>
-        <w:rPr>
-          <w:sz w:val="24"/>
-          <w:szCs w:val="24"/>
-        </w:rPr>
-        <w:t xml:space="preserve"> </w:t>
-      </w:r>
-      <w:proofErr w:type="spellStart"/>
-      <w:r>
-        <w:rPr>
-          <w:sz w:val="24"/>
-          <w:szCs w:val="24"/>
-        </w:rPr>
-        <w:t>backgorundnya</w:t>
-      </w:r>
-      <w:proofErr w:type="spellEnd"/>
-      <w:r>
-        <w:rPr>
-          <w:sz w:val="24"/>
-          <w:szCs w:val="24"/>
-        </w:rPr>
-        <w:t xml:space="preserve">, </w:t>
-      </w:r>
-      <w:proofErr w:type="spellStart"/>
-      <w:r>
-        <w:rPr>
-          <w:sz w:val="24"/>
-          <w:szCs w:val="24"/>
-        </w:rPr>
-        <w:t>coba</w:t>
-      </w:r>
-      <w:proofErr w:type="spellEnd"/>
-      <w:r>
-        <w:rPr>
-          <w:sz w:val="24"/>
-          <w:szCs w:val="24"/>
-        </w:rPr>
-        <w:t xml:space="preserve"> </w:t>
-      </w:r>
-      <w:proofErr w:type="spellStart"/>
-      <w:r>
-        <w:rPr>
-          <w:sz w:val="24"/>
-          <w:szCs w:val="24"/>
-        </w:rPr>
-        <w:t>terangkan</w:t>
-      </w:r>
-      <w:proofErr w:type="spellEnd"/>
-      <w:r>
-        <w:rPr>
-          <w:sz w:val="24"/>
-          <w:szCs w:val="24"/>
-        </w:rPr>
-        <w:t xml:space="preserve"> </w:t>
-      </w:r>
-      <w:proofErr w:type="spellStart"/>
-      <w:r>
-        <w:rPr>
-          <w:sz w:val="24"/>
-          <w:szCs w:val="24"/>
-        </w:rPr>
-        <w:t>agak</w:t>
-      </w:r>
-      <w:proofErr w:type="spellEnd"/>
-      <w:r>
-        <w:rPr>
-          <w:sz w:val="24"/>
-          <w:szCs w:val="24"/>
-        </w:rPr>
-        <w:t xml:space="preserve"> </w:t>
-      </w:r>
-      <w:proofErr w:type="spellStart"/>
-      <w:r>
-        <w:rPr>
-          <w:sz w:val="24"/>
-          <w:szCs w:val="24"/>
-        </w:rPr>
-        <w:t>dikit</w:t>
-      </w:r>
-      <w:proofErr w:type="spellEnd"/>
-      <w:r>
-        <w:rPr>
-          <w:sz w:val="24"/>
-          <w:szCs w:val="24"/>
-        </w:rPr>
-        <w:t xml:space="preserve"> yang </w:t>
-      </w:r>
-      <w:proofErr w:type="spellStart"/>
-      <w:r>
-        <w:rPr>
-          <w:sz w:val="24"/>
-          <w:szCs w:val="24"/>
-        </w:rPr>
-        <w:t>sekiranya</w:t>
-      </w:r>
-      <w:proofErr w:type="spellEnd"/>
-      <w:r>
-        <w:rPr>
-          <w:sz w:val="24"/>
-          <w:szCs w:val="24"/>
-        </w:rPr>
-        <w:t xml:space="preserve"> background dan motif </w:t>
-      </w:r>
-      <w:proofErr w:type="spellStart"/>
-      <w:r>
-        <w:rPr>
-          <w:sz w:val="24"/>
-          <w:szCs w:val="24"/>
-        </w:rPr>
-        <w:t>batiknya</w:t>
-      </w:r>
-      <w:proofErr w:type="spellEnd"/>
-      <w:r>
-        <w:rPr>
-          <w:sz w:val="24"/>
-          <w:szCs w:val="24"/>
-        </w:rPr>
-        <w:t xml:space="preserve"> </w:t>
-      </w:r>
-      <w:proofErr w:type="spellStart"/>
-      <w:r>
-        <w:rPr>
-          <w:sz w:val="24"/>
-          <w:szCs w:val="24"/>
-        </w:rPr>
-        <w:t>itu</w:t>
-      </w:r>
-      <w:proofErr w:type="spellEnd"/>
-      <w:r>
-        <w:rPr>
-          <w:sz w:val="24"/>
-          <w:szCs w:val="24"/>
-        </w:rPr>
-        <w:t xml:space="preserve"> </w:t>
-      </w:r>
-      <w:proofErr w:type="spellStart"/>
-      <w:r>
-        <w:rPr>
-          <w:sz w:val="24"/>
-          <w:szCs w:val="24"/>
-        </w:rPr>
-        <w:t>keliatan</w:t>
-      </w:r>
-      <w:proofErr w:type="spellEnd"/>
-      <w:r>
-        <w:rPr>
-          <w:sz w:val="24"/>
-          <w:szCs w:val="24"/>
-        </w:rPr>
-        <w:t>.</w:t>
-      </w:r>
-      <w:r>
-        <w:rPr>
-          <w:sz w:val="24"/>
-          <w:szCs w:val="24"/>
-        </w:rPr>
-        <w:br/>
-      </w:r>
-      <w:r>
-        <w:rPr>
-          <w:sz w:val="24"/>
-          <w:szCs w:val="24"/>
-        </w:rPr>
-        <w:br/>
-      </w:r>
-      <w:r>
+        <w:t>gini</w:t>
+      </w:r>
+      <w:proofErr w:type="spellEnd"/>
+      <w:r>
+        <w:rPr>
+          <w:sz w:val="24"/>
+          <w:szCs w:val="24"/>
+        </w:rPr>
+        <w:t>?</w:t>
+      </w:r>
+    </w:p>
+    <w:p>
+      <w:pPr>
         <w:rPr>
           <w:b/>
           <w:bCs/>
           <w:sz w:val="24"/>
           <w:szCs w:val="24"/>
         </w:rPr>
-        <w:t xml:space="preserve">Explore </w:t>
-      </w:r>
-      <w:proofErr w:type="gramStart"/>
+      </w:pPr>
       <w:r>
         <w:rPr>
           <w:b/>
@@ -768,9 +505,8 @@
           <w:sz w:val="24"/>
           <w:szCs w:val="24"/>
         </w:rPr>
-        <w:t>Map :</w:t>
-      </w:r>
-      <w:proofErr w:type="gramEnd"/>
+        <w:t xml:space="preserve">4. </w:t>
+      </w:r>
       <w:r>
         <w:rPr>
           <w:b/>
@@ -778,55 +514,57 @@
           <w:sz w:val="24"/>
           <w:szCs w:val="24"/>
         </w:rPr>
-        <w:br/>
-        <w:t xml:space="preserve">1. </w:t>
-      </w:r>
-      <w:r>
-        <w:rPr>
-          <w:sz w:val="24"/>
-          <w:szCs w:val="24"/>
-        </w:rPr>
-        <w:t xml:space="preserve">Jarak </w:t>
-      </w:r>
-      <w:proofErr w:type="spellStart"/>
-      <w:r>
-        <w:rPr>
-          <w:sz w:val="24"/>
-          <w:szCs w:val="24"/>
-        </w:rPr>
-        <w:t>antara</w:t>
-      </w:r>
-      <w:proofErr w:type="spellEnd"/>
-      <w:r>
-        <w:rPr>
-          <w:sz w:val="24"/>
-          <w:szCs w:val="24"/>
-        </w:rPr>
-        <w:t xml:space="preserve"> hero </w:t>
-      </w:r>
-      <w:proofErr w:type="spellStart"/>
-      <w:r>
-        <w:rPr>
-          <w:sz w:val="24"/>
-          <w:szCs w:val="24"/>
-        </w:rPr>
-        <w:t>sama</w:t>
-      </w:r>
-      <w:proofErr w:type="spellEnd"/>
-      <w:r>
-        <w:rPr>
-          <w:sz w:val="24"/>
-          <w:szCs w:val="24"/>
-        </w:rPr>
-        <w:t xml:space="preserve"> navbar </w:t>
-      </w:r>
-      <w:proofErr w:type="spellStart"/>
-      <w:r>
-        <w:rPr>
-          <w:sz w:val="24"/>
-          <w:szCs w:val="24"/>
-        </w:rPr>
-        <w:t>masih</w:t>
+        <w:drawing>
+          <wp:inline distT="0" distB="0" distL="0" distR="0" wp14:anchorId="164ACD78" wp14:editId="3ED7C49F">
+            <wp:extent cx="2432538" cy="1368269"/>
+            <wp:effectExtent l="0" t="0" r="6350" b="3810"/>
+            <wp:docPr id="995599855" name="Picture 1"/>
+            <wp:cNvGraphicFramePr>
+              <a:graphicFrameLocks xmlns:a="http://schemas.openxmlformats.org/drawingml/2006/main" noChangeAspect="1"/>
+            </wp:cNvGraphicFramePr>
+            <a:graphic xmlns:a="http://schemas.openxmlformats.org/drawingml/2006/main">
+              <a:graphicData uri="http://schemas.openxmlformats.org/drawingml/2006/picture">
+                <pic:pic xmlns:pic="http://schemas.openxmlformats.org/drawingml/2006/picture">
+                  <pic:nvPicPr>
+                    <pic:cNvPr id="995599855" name=""/>
+                    <pic:cNvPicPr/>
+                  </pic:nvPicPr>
+                  <pic:blipFill>
+                    <a:blip r:embed="rId7"/>
+                    <a:stretch>
+                      <a:fillRect/>
+                    </a:stretch>
+                  </pic:blipFill>
+                  <pic:spPr>
+                    <a:xfrm>
+                      <a:off x="0" y="0"/>
+                      <a:ext cx="2455357" cy="1381104"/>
+                    </a:xfrm>
+                    <a:prstGeom prst="rect">
+                      <a:avLst/>
+                    </a:prstGeom>
+                  </pic:spPr>
+                </pic:pic>
+              </a:graphicData>
+            </a:graphic>
+          </wp:inline>
+        </w:drawing>
+      </w:r>
+    </w:p>
+    <w:p>
+      <w:pPr>
+        <w:rPr>
+          <w:sz w:val="24"/>
+          <w:szCs w:val="24"/>
+        </w:rPr>
+      </w:pPr>
+      <w:proofErr w:type="spellStart"/>
+      <w:r>
+        <w:rPr>
+          <w:sz w:val="24"/>
+          <w:szCs w:val="24"/>
+        </w:rPr>
+        <w:t>Gradingnya</w:t>
       </w:r>
       <w:proofErr w:type="spellEnd"/>
       <w:r>
@@ -842,23 +580,7 @@
           <w:sz w:val="24"/>
           <w:szCs w:val="24"/>
         </w:rPr>
-        <w:t>kedekatan</w:t>
-      </w:r>
-      <w:proofErr w:type="spellEnd"/>
-      <w:r>
-        <w:rPr>
-          <w:sz w:val="24"/>
-          <w:szCs w:val="24"/>
-        </w:rPr>
-        <w:t xml:space="preserve"> buat yang </w:t>
-      </w:r>
-      <w:proofErr w:type="spellStart"/>
-      <w:r>
-        <w:rPr>
-          <w:sz w:val="24"/>
-          <w:szCs w:val="24"/>
-        </w:rPr>
-        <w:t>agak</w:t>
+        <w:t>seuaikan</w:t>
       </w:r>
       <w:proofErr w:type="spellEnd"/>
       <w:r>
@@ -874,7 +596,23 @@
           <w:sz w:val="24"/>
           <w:szCs w:val="24"/>
         </w:rPr>
-        <w:t>longgar</w:t>
+        <w:t>dengan</w:t>
+      </w:r>
+      <w:proofErr w:type="spellEnd"/>
+      <w:r>
+        <w:rPr>
+          <w:sz w:val="24"/>
+          <w:szCs w:val="24"/>
+        </w:rPr>
+        <w:t xml:space="preserve"> yang lain </w:t>
+      </w:r>
+      <w:proofErr w:type="spellStart"/>
+      <w:r>
+        <w:rPr>
+          <w:sz w:val="24"/>
+          <w:szCs w:val="24"/>
+        </w:rPr>
+        <w:t>warna</w:t>
       </w:r>
       <w:proofErr w:type="spellEnd"/>
       <w:r>
@@ -890,7 +628,23 @@
           <w:sz w:val="24"/>
           <w:szCs w:val="24"/>
         </w:rPr>
-        <w:t>kebawah</w:t>
+        <w:t>gelap</w:t>
+      </w:r>
+      <w:proofErr w:type="spellEnd"/>
+      <w:r>
+        <w:rPr>
+          <w:sz w:val="24"/>
+          <w:szCs w:val="24"/>
+        </w:rPr>
+        <w:t xml:space="preserve">. Dan </w:t>
+      </w:r>
+      <w:proofErr w:type="spellStart"/>
+      <w:r>
+        <w:rPr>
+          <w:sz w:val="24"/>
+          <w:szCs w:val="24"/>
+        </w:rPr>
+        <w:t>saranku</w:t>
       </w:r>
       <w:proofErr w:type="spellEnd"/>
       <w:r>
@@ -906,7 +660,7 @@
           <w:sz w:val="24"/>
           <w:szCs w:val="24"/>
         </w:rPr>
-        <w:t>gpp</w:t>
+        <w:t>untuk</w:t>
       </w:r>
       <w:proofErr w:type="spellEnd"/>
       <w:r>
@@ -922,64 +676,169 @@
           <w:sz w:val="24"/>
           <w:szCs w:val="24"/>
         </w:rPr>
-        <w:t>soale</w:t>
-      </w:r>
-      <w:proofErr w:type="spellEnd"/>
-      <w:r>
-        <w:rPr>
-          <w:sz w:val="24"/>
-          <w:szCs w:val="24"/>
-        </w:rPr>
-        <w:t xml:space="preserve"> kaya </w:t>
-      </w:r>
-      <w:proofErr w:type="spellStart"/>
-      <w:r>
-        <w:rPr>
-          <w:sz w:val="24"/>
-          <w:szCs w:val="24"/>
-        </w:rPr>
-        <w:t>gaada</w:t>
-      </w:r>
-      <w:proofErr w:type="spellEnd"/>
-      <w:r>
-        <w:rPr>
-          <w:sz w:val="24"/>
-          <w:szCs w:val="24"/>
-        </w:rPr>
-        <w:t xml:space="preserve"> space </w:t>
-      </w:r>
-      <w:proofErr w:type="spellStart"/>
-      <w:r>
-        <w:rPr>
-          <w:sz w:val="24"/>
-          <w:szCs w:val="24"/>
-        </w:rPr>
-        <w:t>kosong</w:t>
-      </w:r>
-      <w:proofErr w:type="spellEnd"/>
-      <w:r>
-        <w:rPr>
-          <w:sz w:val="24"/>
-          <w:szCs w:val="24"/>
-        </w:rPr>
-        <w:t xml:space="preserve"> kaya </w:t>
-      </w:r>
-      <w:proofErr w:type="spellStart"/>
-      <w:r>
-        <w:rPr>
-          <w:sz w:val="24"/>
-          <w:szCs w:val="24"/>
-        </w:rPr>
-        <w:t>kepadeten</w:t>
-      </w:r>
-      <w:proofErr w:type="spellEnd"/>
-      <w:r>
-        <w:rPr>
-          <w:sz w:val="24"/>
-          <w:szCs w:val="24"/>
-        </w:rPr>
-        <w:t>.</w:t>
-      </w:r>
+        <w:t>semua</w:t>
+      </w:r>
+      <w:proofErr w:type="spellEnd"/>
+      <w:r>
+        <w:rPr>
+          <w:sz w:val="24"/>
+          <w:szCs w:val="24"/>
+        </w:rPr>
+        <w:t xml:space="preserve"> hero section </w:t>
+      </w:r>
+      <w:proofErr w:type="spellStart"/>
+      <w:r>
+        <w:rPr>
+          <w:sz w:val="24"/>
+          <w:szCs w:val="24"/>
+        </w:rPr>
+        <w:t>bg</w:t>
+      </w:r>
+      <w:proofErr w:type="spellEnd"/>
+      <w:r>
+        <w:rPr>
+          <w:sz w:val="24"/>
+          <w:szCs w:val="24"/>
+        </w:rPr>
+        <w:t xml:space="preserve"> </w:t>
+      </w:r>
+      <w:proofErr w:type="spellStart"/>
+      <w:r>
+        <w:rPr>
+          <w:sz w:val="24"/>
+          <w:szCs w:val="24"/>
+        </w:rPr>
+        <w:t>untuk</w:t>
+      </w:r>
+      <w:proofErr w:type="spellEnd"/>
+      <w:r>
+        <w:rPr>
+          <w:sz w:val="24"/>
+          <w:szCs w:val="24"/>
+        </w:rPr>
+        <w:t xml:space="preserve"> 3 </w:t>
+      </w:r>
+      <w:proofErr w:type="spellStart"/>
+      <w:r>
+        <w:rPr>
+          <w:sz w:val="24"/>
+          <w:szCs w:val="24"/>
+        </w:rPr>
+        <w:t>halaman</w:t>
+      </w:r>
+      <w:proofErr w:type="spellEnd"/>
+      <w:r>
+        <w:rPr>
+          <w:sz w:val="24"/>
+          <w:szCs w:val="24"/>
+        </w:rPr>
+        <w:t xml:space="preserve"> quiz </w:t>
+      </w:r>
+      <w:proofErr w:type="spellStart"/>
+      <w:r>
+        <w:rPr>
+          <w:sz w:val="24"/>
+          <w:szCs w:val="24"/>
+        </w:rPr>
+        <w:t>tersebut</w:t>
+      </w:r>
+      <w:proofErr w:type="spellEnd"/>
+      <w:r>
+        <w:rPr>
+          <w:sz w:val="24"/>
+          <w:szCs w:val="24"/>
+        </w:rPr>
+        <w:t xml:space="preserve"> </w:t>
+      </w:r>
+      <w:proofErr w:type="spellStart"/>
+      <w:r>
+        <w:rPr>
+          <w:sz w:val="24"/>
+          <w:szCs w:val="24"/>
+        </w:rPr>
+        <w:t>samakan</w:t>
+      </w:r>
+      <w:proofErr w:type="spellEnd"/>
+      <w:r>
+        <w:rPr>
+          <w:sz w:val="24"/>
+          <w:szCs w:val="24"/>
+        </w:rPr>
+        <w:t xml:space="preserve"> </w:t>
+      </w:r>
+      <w:proofErr w:type="spellStart"/>
+      <w:r>
+        <w:rPr>
+          <w:sz w:val="24"/>
+          <w:szCs w:val="24"/>
+        </w:rPr>
+        <w:t>seperti</w:t>
+      </w:r>
+      <w:proofErr w:type="spellEnd"/>
+      <w:r>
+        <w:rPr>
+          <w:sz w:val="24"/>
+          <w:szCs w:val="24"/>
+        </w:rPr>
+        <w:t xml:space="preserve"> hero yang lain buat </w:t>
+      </w:r>
+      <w:proofErr w:type="spellStart"/>
+      <w:r>
+        <w:rPr>
+          <w:sz w:val="24"/>
+          <w:szCs w:val="24"/>
+        </w:rPr>
+        <w:t>jadi</w:t>
+      </w:r>
+      <w:proofErr w:type="spellEnd"/>
+      <w:r>
+        <w:rPr>
+          <w:sz w:val="24"/>
+          <w:szCs w:val="24"/>
+        </w:rPr>
+        <w:t xml:space="preserve"> full 1 screen </w:t>
+      </w:r>
+      <w:proofErr w:type="spellStart"/>
+      <w:r>
+        <w:rPr>
+          <w:sz w:val="24"/>
+          <w:szCs w:val="24"/>
+        </w:rPr>
+        <w:t>jangan</w:t>
+      </w:r>
+      <w:proofErr w:type="spellEnd"/>
+      <w:r>
+        <w:rPr>
+          <w:sz w:val="24"/>
+          <w:szCs w:val="24"/>
+        </w:rPr>
+        <w:t xml:space="preserve"> </w:t>
+      </w:r>
+      <w:proofErr w:type="spellStart"/>
+      <w:r>
+        <w:rPr>
+          <w:sz w:val="24"/>
+          <w:szCs w:val="24"/>
+        </w:rPr>
+        <w:t>sampai</w:t>
+      </w:r>
+      <w:proofErr w:type="spellEnd"/>
+      <w:r>
+        <w:rPr>
+          <w:sz w:val="24"/>
+          <w:szCs w:val="24"/>
+        </w:rPr>
+        <w:t xml:space="preserve"> </w:t>
+      </w:r>
+      <w:proofErr w:type="spellStart"/>
+      <w:r>
+        <w:rPr>
+          <w:sz w:val="24"/>
+          <w:szCs w:val="24"/>
+        </w:rPr>
+        <w:t>kepotong</w:t>
+      </w:r>
+      <w:proofErr w:type="spellEnd"/>
     </w:p>
     <w:p>
       <w:pPr>
@@ -1009,6 +868,15 @@
         <w:t>Home :</w:t>
       </w:r>
       <w:proofErr w:type="gramEnd"/>
+      <w:r>
+        <w:rPr>
+          <w:b/>
+          <w:bCs/>
+          <w:sz w:val="24"/>
+          <w:szCs w:val="24"/>
+        </w:rPr>
+        <w:t xml:space="preserve"> </w:t>
+      </w:r>
     </w:p>
     <w:p>
       <w:pPr>
@@ -1026,15 +894,49 @@
         </w:rPr>
         <w:t xml:space="preserve">1. </w:t>
       </w:r>
-      <w:proofErr w:type="spellStart"/>
-      <w:r>
-        <w:rPr>
-          <w:sz w:val="24"/>
-          <w:szCs w:val="24"/>
-        </w:rPr>
-        <w:t>Saranku</w:t>
-      </w:r>
-      <w:proofErr w:type="spellEnd"/>
+      <w:r>
+        <w:rPr>
+          <w:b/>
+          <w:bCs/>
+          <w:sz w:val="24"/>
+          <w:szCs w:val="24"/>
+        </w:rPr>
+        <w:drawing>
+          <wp:inline distT="0" distB="0" distL="0" distR="0" wp14:anchorId="12AA567E" wp14:editId="252DF0C2">
+            <wp:extent cx="1652953" cy="595805"/>
+            <wp:effectExtent l="0" t="0" r="4445" b="0"/>
+            <wp:docPr id="1972711255" name="Picture 1"/>
+            <wp:cNvGraphicFramePr>
+              <a:graphicFrameLocks xmlns:a="http://schemas.openxmlformats.org/drawingml/2006/main" noChangeAspect="1"/>
+            </wp:cNvGraphicFramePr>
+            <a:graphic xmlns:a="http://schemas.openxmlformats.org/drawingml/2006/main">
+              <a:graphicData uri="http://schemas.openxmlformats.org/drawingml/2006/picture">
+                <pic:pic xmlns:pic="http://schemas.openxmlformats.org/drawingml/2006/picture">
+                  <pic:nvPicPr>
+                    <pic:cNvPr id="1972711255" name=""/>
+                    <pic:cNvPicPr/>
+                  </pic:nvPicPr>
+                  <pic:blipFill>
+                    <a:blip r:embed="rId8"/>
+                    <a:stretch>
+                      <a:fillRect/>
+                    </a:stretch>
+                  </pic:blipFill>
+                  <pic:spPr>
+                    <a:xfrm>
+                      <a:off x="0" y="0"/>
+                      <a:ext cx="1673200" cy="603103"/>
+                    </a:xfrm>
+                    <a:prstGeom prst="rect">
+                      <a:avLst/>
+                    </a:prstGeom>
+                  </pic:spPr>
+                </pic:pic>
+              </a:graphicData>
+            </a:graphic>
+          </wp:inline>
+        </w:drawing>
+      </w:r>
       <w:r>
         <w:rPr>
           <w:sz w:val="24"/>
@@ -1042,93 +944,28 @@
         </w:rPr>
         <w:t xml:space="preserve"> </w:t>
       </w:r>
-      <w:proofErr w:type="spellStart"/>
-      <w:r>
-        <w:rPr>
-          <w:sz w:val="24"/>
-          <w:szCs w:val="24"/>
-        </w:rPr>
-        <w:t>bagian</w:t>
-      </w:r>
-      <w:proofErr w:type="spellEnd"/>
-      <w:r>
-        <w:rPr>
-          <w:sz w:val="24"/>
-          <w:szCs w:val="24"/>
-        </w:rPr>
-        <w:t xml:space="preserve"> hero </w:t>
-      </w:r>
-      <w:proofErr w:type="spellStart"/>
-      <w:r>
-        <w:rPr>
-          <w:sz w:val="24"/>
-          <w:szCs w:val="24"/>
-        </w:rPr>
-        <w:t>bg</w:t>
-      </w:r>
-      <w:proofErr w:type="spellEnd"/>
-      <w:r>
-        <w:rPr>
-          <w:sz w:val="24"/>
-          <w:szCs w:val="24"/>
-        </w:rPr>
-        <w:t xml:space="preserve"> image </w:t>
-      </w:r>
-      <w:proofErr w:type="spellStart"/>
-      <w:r>
-        <w:rPr>
-          <w:sz w:val="24"/>
-          <w:szCs w:val="24"/>
-        </w:rPr>
-        <w:t>iku</w:t>
-      </w:r>
-      <w:proofErr w:type="spellEnd"/>
-      <w:r>
-        <w:rPr>
-          <w:sz w:val="24"/>
-          <w:szCs w:val="24"/>
-        </w:rPr>
-        <w:t xml:space="preserve"> grading </w:t>
-      </w:r>
-      <w:proofErr w:type="spellStart"/>
-      <w:r>
-        <w:rPr>
-          <w:sz w:val="24"/>
-          <w:szCs w:val="24"/>
-        </w:rPr>
-        <w:t>warna</w:t>
-      </w:r>
-      <w:proofErr w:type="spellEnd"/>
-      <w:r>
-        <w:rPr>
-          <w:sz w:val="24"/>
-          <w:szCs w:val="24"/>
-        </w:rPr>
-        <w:t xml:space="preserve"> e </w:t>
-      </w:r>
-      <w:proofErr w:type="spellStart"/>
-      <w:r>
-        <w:rPr>
-          <w:sz w:val="24"/>
-          <w:szCs w:val="24"/>
-        </w:rPr>
-        <w:t>samakan</w:t>
-      </w:r>
-      <w:proofErr w:type="spellEnd"/>
-      <w:r>
-        <w:rPr>
-          <w:sz w:val="24"/>
-          <w:szCs w:val="24"/>
-        </w:rPr>
-        <w:t xml:space="preserve"> kaya hero yang laine di </w:t>
-      </w:r>
-      <w:proofErr w:type="spellStart"/>
-      <w:r>
-        <w:rPr>
-          <w:sz w:val="24"/>
-          <w:szCs w:val="24"/>
-        </w:rPr>
-        <w:t>coba</w:t>
+    </w:p>
+    <w:p>
+      <w:pPr>
+        <w:rPr>
+          <w:sz w:val="24"/>
+          <w:szCs w:val="24"/>
+        </w:rPr>
+      </w:pPr>
+      <w:r>
+        <w:rPr>
+          <w:sz w:val="24"/>
+          <w:szCs w:val="24"/>
+        </w:rPr>
+        <w:t xml:space="preserve">Ubah </w:t>
+      </w:r>
+      <w:proofErr w:type="spellStart"/>
+      <w:r>
+        <w:rPr>
+          <w:sz w:val="24"/>
+          <w:szCs w:val="24"/>
+        </w:rPr>
+        <w:t>teknya</w:t>
       </w:r>
       <w:proofErr w:type="spellEnd"/>
       <w:r>
@@ -1144,7 +981,23 @@
           <w:sz w:val="24"/>
           <w:szCs w:val="24"/>
         </w:rPr>
-        <w:t>cocok</w:t>
+        <w:t>ke</w:t>
+      </w:r>
+      <w:proofErr w:type="spellEnd"/>
+      <w:r>
+        <w:rPr>
+          <w:sz w:val="24"/>
+          <w:szCs w:val="24"/>
+        </w:rPr>
+        <w:t xml:space="preserve"> bold </w:t>
+      </w:r>
+      <w:proofErr w:type="spellStart"/>
+      <w:r>
+        <w:rPr>
+          <w:sz w:val="24"/>
+          <w:szCs w:val="24"/>
+        </w:rPr>
+        <w:t>biar</w:t>
       </w:r>
       <w:proofErr w:type="spellEnd"/>
       <w:r>
@@ -1160,23 +1013,23 @@
           <w:sz w:val="24"/>
           <w:szCs w:val="24"/>
         </w:rPr>
-        <w:t>engga</w:t>
-      </w:r>
-      <w:proofErr w:type="spellEnd"/>
-      <w:r>
-        <w:rPr>
-          <w:sz w:val="24"/>
-          <w:szCs w:val="24"/>
-        </w:rPr>
-        <w:t xml:space="preserve">, nek </w:t>
-      </w:r>
-      <w:proofErr w:type="spellStart"/>
-      <w:r>
-        <w:rPr>
-          <w:sz w:val="24"/>
-          <w:szCs w:val="24"/>
-        </w:rPr>
-        <w:t>kurang</w:t>
+        <w:t>ngga</w:t>
+      </w:r>
+      <w:proofErr w:type="spellEnd"/>
+      <w:r>
+        <w:rPr>
+          <w:sz w:val="24"/>
+          <w:szCs w:val="24"/>
+        </w:rPr>
+        <w:t xml:space="preserve"> kurus </w:t>
+      </w:r>
+      <w:proofErr w:type="spellStart"/>
+      <w:r>
+        <w:rPr>
+          <w:sz w:val="24"/>
+          <w:szCs w:val="24"/>
+        </w:rPr>
+        <w:t>kelaparan</w:t>
       </w:r>
       <w:proofErr w:type="spellEnd"/>
       <w:r>
@@ -1192,159 +1045,15 @@
           <w:sz w:val="24"/>
           <w:szCs w:val="24"/>
         </w:rPr>
-        <w:t>cocok</w:t>
-      </w:r>
-      <w:proofErr w:type="spellEnd"/>
-      <w:r>
-        <w:rPr>
-          <w:sz w:val="24"/>
-          <w:szCs w:val="24"/>
-        </w:rPr>
-        <w:t xml:space="preserve"> di hapus ae grading e, </w:t>
-      </w:r>
-      <w:proofErr w:type="spellStart"/>
-      <w:r>
-        <w:rPr>
-          <w:sz w:val="24"/>
-          <w:szCs w:val="24"/>
-        </w:rPr>
-        <w:t>soale</w:t>
-      </w:r>
-      <w:proofErr w:type="spellEnd"/>
-      <w:r>
-        <w:rPr>
-          <w:sz w:val="24"/>
-          <w:szCs w:val="24"/>
-        </w:rPr>
-        <w:t xml:space="preserve"> </w:t>
-      </w:r>
-      <w:proofErr w:type="spellStart"/>
-      <w:r>
-        <w:rPr>
-          <w:sz w:val="24"/>
-          <w:szCs w:val="24"/>
-        </w:rPr>
-        <w:t>cek</w:t>
-      </w:r>
-      <w:proofErr w:type="spellEnd"/>
-      <w:r>
-        <w:rPr>
-          <w:sz w:val="24"/>
-          <w:szCs w:val="24"/>
-        </w:rPr>
-        <w:t xml:space="preserve"> </w:t>
-      </w:r>
-      <w:proofErr w:type="spellStart"/>
-      <w:r>
-        <w:rPr>
-          <w:sz w:val="24"/>
-          <w:szCs w:val="24"/>
-        </w:rPr>
-        <w:t>selaras</w:t>
-      </w:r>
-      <w:proofErr w:type="spellEnd"/>
-      <w:r>
-        <w:rPr>
-          <w:sz w:val="24"/>
-          <w:szCs w:val="24"/>
-        </w:rPr>
-        <w:t xml:space="preserve"> </w:t>
-      </w:r>
-      <w:proofErr w:type="spellStart"/>
-      <w:r>
-        <w:rPr>
-          <w:sz w:val="24"/>
-          <w:szCs w:val="24"/>
-        </w:rPr>
-        <w:t>seluruh</w:t>
-      </w:r>
-      <w:proofErr w:type="spellEnd"/>
-      <w:r>
-        <w:rPr>
-          <w:sz w:val="24"/>
-          <w:szCs w:val="24"/>
-        </w:rPr>
-        <w:t xml:space="preserve"> hero </w:t>
-      </w:r>
-      <w:proofErr w:type="spellStart"/>
-      <w:r>
-        <w:rPr>
-          <w:sz w:val="24"/>
-          <w:szCs w:val="24"/>
-        </w:rPr>
-        <w:t>dari</w:t>
-      </w:r>
-      <w:proofErr w:type="spellEnd"/>
-      <w:r>
-        <w:rPr>
-          <w:sz w:val="24"/>
-          <w:szCs w:val="24"/>
-        </w:rPr>
-        <w:t xml:space="preserve"> </w:t>
-      </w:r>
-      <w:proofErr w:type="spellStart"/>
-      <w:r>
-        <w:rPr>
-          <w:sz w:val="24"/>
-          <w:szCs w:val="24"/>
-        </w:rPr>
-        <w:t>warna</w:t>
-      </w:r>
-      <w:proofErr w:type="spellEnd"/>
-      <w:r>
-        <w:rPr>
-          <w:sz w:val="24"/>
-          <w:szCs w:val="24"/>
-        </w:rPr>
-        <w:t xml:space="preserve"> grading </w:t>
-      </w:r>
-      <w:proofErr w:type="spellStart"/>
-      <w:r>
-        <w:rPr>
-          <w:sz w:val="24"/>
-          <w:szCs w:val="24"/>
-        </w:rPr>
-        <w:t>dll</w:t>
-      </w:r>
-      <w:proofErr w:type="spellEnd"/>
-      <w:r>
-        <w:rPr>
-          <w:sz w:val="24"/>
-          <w:szCs w:val="24"/>
-        </w:rPr>
-        <w:t xml:space="preserve"> e, </w:t>
-      </w:r>
-      <w:proofErr w:type="spellStart"/>
-      <w:r>
-        <w:rPr>
-          <w:sz w:val="24"/>
-          <w:szCs w:val="24"/>
-        </w:rPr>
-        <w:t>coba</w:t>
-      </w:r>
-      <w:proofErr w:type="spellEnd"/>
-      <w:r>
-        <w:rPr>
-          <w:sz w:val="24"/>
-          <w:szCs w:val="24"/>
-        </w:rPr>
-        <w:t xml:space="preserve"> </w:t>
-      </w:r>
-      <w:proofErr w:type="spellStart"/>
-      <w:r>
-        <w:rPr>
-          <w:sz w:val="24"/>
-          <w:szCs w:val="24"/>
-        </w:rPr>
-        <w:t>sek</w:t>
-      </w:r>
-      <w:proofErr w:type="spellEnd"/>
-      <w:r>
-        <w:rPr>
-          <w:sz w:val="24"/>
-          <w:szCs w:val="24"/>
-        </w:rPr>
-        <w:t>.</w:t>
+        <w:t>kesian</w:t>
+      </w:r>
+      <w:proofErr w:type="spellEnd"/>
+      <w:r>
+        <w:rPr>
+          <w:sz w:val="24"/>
+          <w:szCs w:val="24"/>
+        </w:rPr>
+        <w:t>/</w:t>
       </w:r>
     </w:p>
     <w:sectPr>

</xml_diff>